<commit_message>
Reestructurar borradores: 1 (solo Cap I), 2 (I+II), 3 (I+II+III), 4 (I+II+III+IV)
</commit_message>
<xml_diff>
--- a/keidy/reportes/Informe_Pasantia_IUTECP_BORRADOR2.docx
+++ b/keidy/reportes/Informe_Pasantia_IUTECP_BORRADOR2.docx
@@ -1064,216 +1064,6 @@
         </w:rPr>
         <w:fldChar w:fldCharType="begin"/>
         <w:instrText xml:space="preserve"> PAGEREF bm_cap2_crono \h </w:instrText>
-        <w:fldChar w:fldCharType="separate"/>
-        <w:t>?</w:t>
-        <w:fldChar w:fldCharType="end"/>
-      </w:r>
-    </w:p>
-    <w:p>
-      <w:pPr>
-        <w:tabs>
-          <w:tab w:pos="8271" w:val="right" w:leader="dot"/>
-        </w:tabs>
-        <w:spacing w:line="360" w:lineRule="auto" w:before="0" w:after="80"/>
-        <w:ind w:left="0"/>
-      </w:pPr>
-      <w:r>
-        <w:rPr>
-          <w:rFonts w:ascii="Times New Roman" w:hAnsi="Times New Roman"/>
-          <w:b/>
-          <w:sz w:val="24"/>
-        </w:rPr>
-        <w:t>III MARCO TEÓRICO</w:t>
-        <w:tab/>
-      </w:r>
-      <w:r>
-        <w:rPr>
-          <w:rFonts w:ascii="Times New Roman" w:hAnsi="Times New Roman"/>
-          <w:b/>
-          <w:sz w:val="24"/>
-        </w:rPr>
-        <w:fldChar w:fldCharType="begin"/>
-        <w:instrText xml:space="preserve"> PAGEREF bm_cap3 \h </w:instrText>
-        <w:fldChar w:fldCharType="separate"/>
-        <w:t>?</w:t>
-        <w:fldChar w:fldCharType="end"/>
-      </w:r>
-    </w:p>
-    <w:p>
-      <w:pPr>
-        <w:tabs>
-          <w:tab w:pos="8271" w:val="right" w:leader="dot"/>
-        </w:tabs>
-        <w:spacing w:line="360" w:lineRule="auto" w:before="0" w:after="80"/>
-        <w:ind w:left="283"/>
-      </w:pPr>
-      <w:r>
-        <w:rPr>
-          <w:rFonts w:ascii="Times New Roman" w:hAnsi="Times New Roman"/>
-          <w:b w:val="0"/>
-          <w:sz w:val="24"/>
-        </w:rPr>
-        <w:t>Bases teóricas referenciales</w:t>
-        <w:tab/>
-      </w:r>
-      <w:r>
-        <w:rPr>
-          <w:rFonts w:ascii="Times New Roman" w:hAnsi="Times New Roman"/>
-          <w:b w:val="0"/>
-          <w:sz w:val="24"/>
-        </w:rPr>
-        <w:fldChar w:fldCharType="begin"/>
-        <w:instrText xml:space="preserve"> PAGEREF bm_cap3_bases \h </w:instrText>
-        <w:fldChar w:fldCharType="separate"/>
-        <w:t>?</w:t>
-        <w:fldChar w:fldCharType="end"/>
-      </w:r>
-    </w:p>
-    <w:p>
-      <w:pPr>
-        <w:tabs>
-          <w:tab w:pos="8271" w:val="right" w:leader="dot"/>
-        </w:tabs>
-        <w:spacing w:line="360" w:lineRule="auto" w:before="0" w:after="80"/>
-        <w:ind w:left="0"/>
-      </w:pPr>
-      <w:r>
-        <w:rPr>
-          <w:rFonts w:ascii="Times New Roman" w:hAnsi="Times New Roman"/>
-          <w:b/>
-          <w:sz w:val="24"/>
-        </w:rPr>
-        <w:t>IV ACTIVIDADES REALIZADAS</w:t>
-        <w:tab/>
-      </w:r>
-      <w:r>
-        <w:rPr>
-          <w:rFonts w:ascii="Times New Roman" w:hAnsi="Times New Roman"/>
-          <w:b/>
-          <w:sz w:val="24"/>
-        </w:rPr>
-        <w:fldChar w:fldCharType="begin"/>
-        <w:instrText xml:space="preserve"> PAGEREF bm_cap4 \h </w:instrText>
-        <w:fldChar w:fldCharType="separate"/>
-        <w:t>?</w:t>
-        <w:fldChar w:fldCharType="end"/>
-      </w:r>
-    </w:p>
-    <w:p>
-      <w:pPr>
-        <w:tabs>
-          <w:tab w:pos="8271" w:val="right" w:leader="dot"/>
-        </w:tabs>
-        <w:spacing w:line="360" w:lineRule="auto" w:before="0" w:after="80"/>
-        <w:ind w:left="283"/>
-      </w:pPr>
-      <w:r>
-        <w:rPr>
-          <w:rFonts w:ascii="Times New Roman" w:hAnsi="Times New Roman"/>
-          <w:b w:val="0"/>
-          <w:sz w:val="24"/>
-        </w:rPr>
-        <w:t>Descripción de actividades ejecutadas por semana</w:t>
-        <w:tab/>
-      </w:r>
-      <w:r>
-        <w:rPr>
-          <w:rFonts w:ascii="Times New Roman" w:hAnsi="Times New Roman"/>
-          <w:b w:val="0"/>
-          <w:sz w:val="24"/>
-        </w:rPr>
-        <w:fldChar w:fldCharType="begin"/>
-        <w:instrText xml:space="preserve"> PAGEREF bm_cap4_desc \h </w:instrText>
-        <w:fldChar w:fldCharType="separate"/>
-        <w:t>?</w:t>
-        <w:fldChar w:fldCharType="end"/>
-      </w:r>
-    </w:p>
-    <w:p>
-      <w:pPr>
-        <w:tabs>
-          <w:tab w:pos="8271" w:val="right" w:leader="dot"/>
-        </w:tabs>
-        <w:spacing w:line="360" w:lineRule="auto" w:before="0" w:after="80"/>
-        <w:ind w:left="0"/>
-      </w:pPr>
-      <w:r>
-        <w:rPr>
-          <w:rFonts w:ascii="Times New Roman" w:hAnsi="Times New Roman"/>
-          <w:b/>
-          <w:sz w:val="24"/>
-        </w:rPr>
-        <w:t>V CONCLUSIONES Y RECOMENDACIONES</w:t>
-        <w:tab/>
-      </w:r>
-      <w:r>
-        <w:rPr>
-          <w:rFonts w:ascii="Times New Roman" w:hAnsi="Times New Roman"/>
-          <w:b/>
-          <w:sz w:val="24"/>
-        </w:rPr>
-        <w:fldChar w:fldCharType="begin"/>
-        <w:instrText xml:space="preserve"> PAGEREF bm_cap5 \h </w:instrText>
-        <w:fldChar w:fldCharType="separate"/>
-        <w:t>?</w:t>
-        <w:fldChar w:fldCharType="end"/>
-      </w:r>
-    </w:p>
-    <w:p>
-      <w:pPr>
-        <w:tabs>
-          <w:tab w:pos="8271" w:val="right" w:leader="dot"/>
-        </w:tabs>
-        <w:spacing w:line="360" w:lineRule="auto" w:before="0" w:after="80"/>
-        <w:ind w:left="283"/>
-      </w:pPr>
-      <w:r>
-        <w:rPr>
-          <w:rFonts w:ascii="Times New Roman" w:hAnsi="Times New Roman"/>
-          <w:b w:val="0"/>
-          <w:sz w:val="24"/>
-        </w:rPr>
-        <w:t>Conclusiones</w:t>
-        <w:tab/>
-      </w:r>
-      <w:r>
-        <w:rPr>
-          <w:rFonts w:ascii="Times New Roman" w:hAnsi="Times New Roman"/>
-          <w:b w:val="0"/>
-          <w:sz w:val="24"/>
-        </w:rPr>
-        <w:fldChar w:fldCharType="begin"/>
-        <w:instrText xml:space="preserve"> PAGEREF bm_cap5_concl \h </w:instrText>
-        <w:fldChar w:fldCharType="separate"/>
-        <w:t>?</w:t>
-        <w:fldChar w:fldCharType="end"/>
-      </w:r>
-    </w:p>
-    <w:p>
-      <w:pPr>
-        <w:tabs>
-          <w:tab w:pos="8271" w:val="right" w:leader="dot"/>
-        </w:tabs>
-        <w:spacing w:line="360" w:lineRule="auto" w:before="0" w:after="80"/>
-        <w:ind w:left="283"/>
-      </w:pPr>
-      <w:r>
-        <w:rPr>
-          <w:rFonts w:ascii="Times New Roman" w:hAnsi="Times New Roman"/>
-          <w:b w:val="0"/>
-          <w:sz w:val="24"/>
-        </w:rPr>
-        <w:t>Recomendaciones</w:t>
-        <w:tab/>
-      </w:r>
-      <w:r>
-        <w:rPr>
-          <w:rFonts w:ascii="Times New Roman" w:hAnsi="Times New Roman"/>
-          <w:b w:val="0"/>
-          <w:sz w:val="24"/>
-        </w:rPr>
-        <w:fldChar w:fldCharType="begin"/>
-        <w:instrText xml:space="preserve"> PAGEREF bm_cap5_recom \h </w:instrText>
         <w:fldChar w:fldCharType="separate"/>
         <w:t>?</w:t>
         <w:fldChar w:fldCharType="end"/>

</xml_diff>